<commit_message>
coverage pics & reset recovery test
Implement UVM Reset Recovery test case and fix SVA reset safety
</commit_message>
<xml_diff>
--- a/docs/FIFO.docx
+++ b/docs/FIFO.docx
@@ -574,6 +574,9 @@
     </w:p>
     <w:p>
       <w:r>
+        <w:rPr>
+          <w:noProof/>
+        </w:rPr>
         <w:drawing>
           <wp:inline distT="0" distB="0" distL="0" distR="0" wp14:anchorId="007683FA" wp14:editId="3E7F53D1">
             <wp:extent cx="4610743" cy="1629002"/>
@@ -621,6 +624,7 @@
         <w:rPr>
           <w:noProof/>
         </w:rPr>
+        <w:lastRenderedPageBreak/>
         <w:drawing>
           <wp:inline distT="0" distB="0" distL="0" distR="0" wp14:anchorId="19FB9BB0" wp14:editId="0A6F42AA">
             <wp:extent cx="3609975" cy="1009650"/>
@@ -724,7 +728,6 @@
     </w:p>
     <w:p>
       <w:r>
-        <w:lastRenderedPageBreak/>
         <w:t>Read to Write Synchronizer:</w:t>
       </w:r>
       <w:r>
@@ -821,8 +824,126 @@
       </w:r>
     </w:p>
     <w:p>
+      <w:pPr>
+        <w:rPr>
+          <w:noProof/>
+        </w:rPr>
+      </w:pPr>
+      <w:r>
+        <w:t>Coverage report:</w:t>
+      </w:r>
+      <w:r>
+        <w:rPr>
+          <w:noProof/>
+        </w:rPr>
+        <w:t xml:space="preserve"> </w:t>
+      </w:r>
+      <w:r>
+        <w:rPr>
+          <w:noProof/>
+        </w:rPr>
+        <w:drawing>
+          <wp:inline distT="0" distB="0" distL="0" distR="0" wp14:anchorId="299952D6" wp14:editId="7A0B91D6">
+            <wp:extent cx="5486400" cy="1848485"/>
+            <wp:effectExtent l="0" t="0" r="0" b="0"/>
+            <wp:docPr id="4" name="Picture 4"/>
+            <wp:cNvGraphicFramePr>
+              <a:graphicFrameLocks xmlns:a="http://schemas.openxmlformats.org/drawingml/2006/main" noChangeAspect="1"/>
+            </wp:cNvGraphicFramePr>
+            <a:graphic xmlns:a="http://schemas.openxmlformats.org/drawingml/2006/main">
+              <a:graphicData uri="http://schemas.openxmlformats.org/drawingml/2006/picture">
+                <pic:pic xmlns:pic="http://schemas.openxmlformats.org/drawingml/2006/picture">
+                  <pic:nvPicPr>
+                    <pic:cNvPr id="4" name="coverage.png"/>
+                    <pic:cNvPicPr/>
+                  </pic:nvPicPr>
+                  <pic:blipFill>
+                    <a:blip r:embed="rId11">
+                      <a:extLst>
+                        <a:ext uri="{28A0092B-C50C-407E-A947-70E740481C1C}">
+                          <a14:useLocalDpi xmlns:a14="http://schemas.microsoft.com/office/drawing/2010/main" val="0"/>
+                        </a:ext>
+                      </a:extLst>
+                    </a:blip>
+                    <a:stretch>
+                      <a:fillRect/>
+                    </a:stretch>
+                  </pic:blipFill>
+                  <pic:spPr>
+                    <a:xfrm>
+                      <a:off x="0" y="0"/>
+                      <a:ext cx="5486400" cy="1848485"/>
+                    </a:xfrm>
+                    <a:prstGeom prst="rect">
+                      <a:avLst/>
+                    </a:prstGeom>
+                  </pic:spPr>
+                </pic:pic>
+              </a:graphicData>
+            </a:graphic>
+          </wp:inline>
+        </w:drawing>
+      </w:r>
+    </w:p>
+    <w:p>
+      <w:r>
+        <w:t>Detailed Design Units Coverage Breakdown</w:t>
+      </w:r>
+      <w:r>
+        <w:t>:</w:t>
+      </w:r>
       <w:bookmarkStart w:id="0" w:name="_GoBack"/>
       <w:bookmarkEnd w:id="0"/>
+    </w:p>
+    <w:p/>
+    <w:p/>
+    <w:p>
+      <w:r>
+        <w:rPr>
+          <w:noProof/>
+        </w:rPr>
+        <w:drawing>
+          <wp:inline distT="0" distB="0" distL="0" distR="0">
+            <wp:extent cx="5486400" cy="2620010"/>
+            <wp:effectExtent l="0" t="0" r="0" b="8890"/>
+            <wp:docPr id="5" name="Picture 5"/>
+            <wp:cNvGraphicFramePr>
+              <a:graphicFrameLocks xmlns:a="http://schemas.openxmlformats.org/drawingml/2006/main" noChangeAspect="1"/>
+            </wp:cNvGraphicFramePr>
+            <a:graphic xmlns:a="http://schemas.openxmlformats.org/drawingml/2006/main">
+              <a:graphicData uri="http://schemas.openxmlformats.org/drawingml/2006/picture">
+                <pic:pic xmlns:pic="http://schemas.openxmlformats.org/drawingml/2006/picture">
+                  <pic:nvPicPr>
+                    <pic:cNvPr id="5" name="coverage_details.png"/>
+                    <pic:cNvPicPr/>
+                  </pic:nvPicPr>
+                  <pic:blipFill>
+                    <a:blip r:embed="rId12">
+                      <a:extLst>
+                        <a:ext uri="{28A0092B-C50C-407E-A947-70E740481C1C}">
+                          <a14:useLocalDpi xmlns:a14="http://schemas.microsoft.com/office/drawing/2010/main" val="0"/>
+                        </a:ext>
+                      </a:extLst>
+                    </a:blip>
+                    <a:stretch>
+                      <a:fillRect/>
+                    </a:stretch>
+                  </pic:blipFill>
+                  <pic:spPr>
+                    <a:xfrm>
+                      <a:off x="0" y="0"/>
+                      <a:ext cx="5486400" cy="2620010"/>
+                    </a:xfrm>
+                    <a:prstGeom prst="rect">
+                      <a:avLst/>
+                    </a:prstGeom>
+                  </pic:spPr>
+                </pic:pic>
+              </a:graphicData>
+            </a:graphic>
+          </wp:inline>
+        </w:drawing>
+      </w:r>
     </w:p>
     <w:sectPr>
       <w:pgSz w:w="12240" w:h="15840"/>
@@ -1249,6 +1370,29 @@
       <w:szCs w:val="32"/>
     </w:rPr>
   </w:style>
+  <w:style w:type="paragraph" w:styleId="Heading3">
+    <w:name w:val="heading 3"/>
+    <w:basedOn w:val="Normal"/>
+    <w:next w:val="Normal"/>
+    <w:link w:val="Heading3Char"/>
+    <w:uiPriority w:val="9"/>
+    <w:semiHidden/>
+    <w:unhideWhenUsed/>
+    <w:qFormat/>
+    <w:rsid w:val="00FA11DC"/>
+    <w:pPr>
+      <w:keepNext/>
+      <w:keepLines/>
+      <w:spacing w:before="40" w:after="0"/>
+      <w:outlineLvl w:val="2"/>
+    </w:pPr>
+    <w:rPr>
+      <w:rFonts w:asciiTheme="majorHAnsi" w:eastAsiaTheme="majorEastAsia" w:hAnsiTheme="majorHAnsi" w:cstheme="majorBidi"/>
+      <w:color w:val="1F4D78" w:themeColor="accent1" w:themeShade="7F"/>
+      <w:sz w:val="24"/>
+      <w:szCs w:val="24"/>
+    </w:rPr>
+  </w:style>
   <w:style w:type="character" w:default="1" w:styleId="DefaultParagraphFont">
     <w:name w:val="Default Paragraph Font"/>
     <w:uiPriority w:val="1"/>
@@ -1321,6 +1465,20 @@
       <w:color w:val="2E74B5" w:themeColor="accent1" w:themeShade="BF"/>
       <w:sz w:val="32"/>
       <w:szCs w:val="32"/>
+    </w:rPr>
+  </w:style>
+  <w:style w:type="character" w:customStyle="1" w:styleId="Heading3Char">
+    <w:name w:val="Heading 3 Char"/>
+    <w:basedOn w:val="DefaultParagraphFont"/>
+    <w:link w:val="Heading3"/>
+    <w:uiPriority w:val="9"/>
+    <w:semiHidden/>
+    <w:rsid w:val="00FA11DC"/>
+    <w:rPr>
+      <w:rFonts w:asciiTheme="majorHAnsi" w:eastAsiaTheme="majorEastAsia" w:hAnsiTheme="majorHAnsi" w:cstheme="majorBidi"/>
+      <w:color w:val="1F4D78" w:themeColor="accent1" w:themeShade="7F"/>
+      <w:sz w:val="24"/>
+      <w:szCs w:val="24"/>
     </w:rPr>
   </w:style>
 </w:styles>
@@ -1592,7 +1750,7 @@
 </file>
 
 <file path=customXml/itemProps1.xml><?xml version="1.0" encoding="utf-8"?>
-<ds:datastoreItem xmlns:ds="http://schemas.openxmlformats.org/officeDocument/2006/customXml" ds:itemID="{BDEBF73F-E294-4505-A3A5-EB5687C50968}">
+<ds:datastoreItem xmlns:ds="http://schemas.openxmlformats.org/officeDocument/2006/customXml" ds:itemID="{F526BC83-9598-4404-8FD3-44A036A00CD0}">
   <ds:schemaRefs>
     <ds:schemaRef ds:uri="http://schemas.openxmlformats.org/officeDocument/2006/bibliography"/>
   </ds:schemaRefs>

</xml_diff>